<commit_message>
feat(routing_algorithms): run Dijkstra on the real GTFS weighted graph
- Add dijkstra.py: builds a graph from weights.txt via gtfs_utils, runs
  dijkstra/cut_dijkstra for a fixed SOURCE/TARGET, and writes the output
  to a per-route text file instead of stdout
- Add print_graph_size to dijkstra_utils.py and call it from dijkstra.py
  and both example scripts
- Add show_unreachable flag to print_distances, used by dijkstra.py to
  skip the many INF-distance stops on the real graph
- Fix the verbose update log in _run_dijkstra to show the adjacent node's
  previous distance instead of the just-extracted node's distance
- Ignore generated routing_algotithms/dijkstra/dijkstra_* output files
</commit_message>
<xml_diff>
--- a/.docu/dijkstra.docx
+++ b/.docu/dijkstra.docx
@@ -1,6 +1,6 @@
 
 <file path=word/document.xml><?xml version="1.0" encoding="utf-8"?>
-<w:document xmlns:wpc="http://schemas.microsoft.com/office/word/2010/wordprocessingCanvas" xmlns:cx="http://schemas.microsoft.com/office/drawing/2014/chartex" xmlns:cx1="http://schemas.microsoft.com/office/drawing/2015/9/8/chartex" xmlns:cx2="http://schemas.microsoft.com/office/drawing/2015/10/21/chartex" xmlns:cx3="http://schemas.microsoft.com/office/drawing/2016/5/9/chartex" xmlns:cx4="http://schemas.microsoft.com/office/drawing/2016/5/10/chartex" xmlns:cx5="http://schemas.microsoft.com/office/drawing/2016/5/11/chartex" xmlns:cx6="http://schemas.microsoft.com/office/drawing/2016/5/12/chartex" xmlns:cx7="http://schemas.microsoft.com/office/drawing/2016/5/13/chartex" xmlns:cx8="http://schemas.microsoft.com/office/drawing/2016/5/14/chartex" xmlns:mc="http://schemas.openxmlformats.org/markup-compatibility/2006" xmlns:aink="http://schemas.microsoft.com/office/drawing/2016/ink" xmlns:am3d="http://schemas.microsoft.com/office/drawing/2017/model3d" xmlns:o="urn:schemas-microsoft-com:office:office" xmlns:oel="http://schemas.microsoft.com/office/2019/extlst" xmlns:r="http://schemas.openxmlformats.org/officeDocument/2006/relationships" xmlns:m="http://schemas.openxmlformats.org/officeDocument/2006/math" xmlns:v="urn:schemas-microsoft-com:vml" xmlns:wp14="http://schemas.microsoft.com/office/word/2010/wordprocessingDrawing" xmlns:wp="http://schemas.openxmlformats.org/drawingml/2006/wordprocessingDrawing" xmlns:w10="urn:schemas-microsoft-com:office:word" xmlns:w="http://schemas.openxmlformats.org/wordprocessingml/2006/main" xmlns:w14="http://schemas.microsoft.com/office/word/2010/wordml" xmlns:w15="http://schemas.microsoft.com/office/word/2012/wordml" xmlns:w16cex="http://schemas.microsoft.com/office/word/2018/wordml/cex" xmlns:w16cid="http://schemas.microsoft.com/office/word/2016/wordml/cid" xmlns:w16="http://schemas.microsoft.com/office/word/2018/wordml" xmlns:w16du="http://schemas.microsoft.com/office/word/2023/wordml/word16du" xmlns:w16sdtdh="http://schemas.microsoft.com/office/word/2020/wordml/sdtdatahash" xmlns:w16sdtfl="http://schemas.microsoft.com/office/word/2024/wordml/sdtformatlock" xmlns:w16se="http://schemas.microsoft.com/office/word/2015/wordml/symex" xmlns:wpg="http://schemas.microsoft.com/office/word/2010/wordprocessingGroup" xmlns:wpi="http://schemas.microsoft.com/office/word/2010/wordprocessingInk" xmlns:wne="http://schemas.microsoft.com/office/word/2006/wordml" xmlns:wps="http://schemas.microsoft.com/office/word/2010/wordprocessingShape" mc:Ignorable="w14 w15 w16se w16cid w16 w16cex w16sdtdh w16sdtfl w16du wp14">
+<w:document xmlns:wpc="http://schemas.microsoft.com/office/word/2010/wordprocessingCanvas" xmlns:cx="http://schemas.microsoft.com/office/drawing/2014/chartex" xmlns:cx1="http://schemas.microsoft.com/office/drawing/2015/9/8/chartex" xmlns:cx2="http://schemas.microsoft.com/office/drawing/2015/10/21/chartex" xmlns:cx3="http://schemas.microsoft.com/office/drawing/2016/5/9/chartex" xmlns:cx4="http://schemas.microsoft.com/office/drawing/2016/5/10/chartex" xmlns:cx5="http://schemas.microsoft.com/office/drawing/2016/5/11/chartex" xmlns:cx6="http://schemas.microsoft.com/office/drawing/2016/5/12/chartex" xmlns:cx7="http://schemas.microsoft.com/office/drawing/2016/5/13/chartex" xmlns:cx8="http://schemas.microsoft.com/office/drawing/2016/5/14/chartex" xmlns:mc="http://schemas.openxmlformats.org/markup-compatibility/2006" xmlns:m="http://schemas.openxmlformats.org/officeDocument/2006/math" xmlns:aink="http://schemas.microsoft.com/office/drawing/2016/ink" xmlns:am3d="http://schemas.microsoft.com/office/drawing/2017/model3d" xmlns:oel="http://schemas.microsoft.com/office/2019/extlst" xmlns:r="http://schemas.openxmlformats.org/officeDocument/2006/relationships" xmlns:wp14="http://schemas.microsoft.com/office/word/2010/wordprocessingDrawing" xmlns:wp="http://schemas.openxmlformats.org/drawingml/2006/wordprocessingDrawing" xmlns:wpg="http://schemas.microsoft.com/office/word/2010/wordprocessingGroup" xmlns:wpi="http://schemas.microsoft.com/office/word/2010/wordprocessingInk" xmlns:wps="http://schemas.microsoft.com/office/word/2010/wordprocessingShape" xmlns:o="urn:schemas-microsoft-com:office:office" xmlns:v="urn:schemas-microsoft-com:vml" xmlns:w10="urn:schemas-microsoft-com:office:word" xmlns:w="http://schemas.openxmlformats.org/wordprocessingml/2006/main" xmlns:w14="http://schemas.microsoft.com/office/word/2010/wordml" xmlns:w15="http://schemas.microsoft.com/office/word/2012/wordml" xmlns:w16cex="http://schemas.microsoft.com/office/word/2018/wordml/cex" xmlns:w16cid="http://schemas.microsoft.com/office/word/2016/wordml/cid" xmlns:w16="http://schemas.microsoft.com/office/word/2018/wordml" xmlns:w16sdtdh="http://schemas.microsoft.com/office/word/2020/wordml/sdtdatahash" xmlns:w16sdtfl="http://schemas.microsoft.com/office/word/2024/wordml/sdtformatlock" xmlns:w16se="http://schemas.microsoft.com/office/word/2015/wordml/symex" xmlns:w16du="http://schemas.microsoft.com/office/word/2023/wordml/word16du" xmlns:wne="http://schemas.microsoft.com/office/word/2006/wordml" mc:Ignorable="w14 w15 w16se w16cid w16 w16cex w16sdtdh w16sdtfl w16du wp14">
   <w:body>
     <w:p>
       <w:pPr>
@@ -12,7 +12,225 @@
         <w:rPr>
           <w:rFonts w:ascii="Arial" w:hAnsi="Arial" w:cs="Arial"/>
         </w:rPr>
+        <w:t>OLD:</w:t>
+      </w:r>
+    </w:p>
+    <w:p>
+      <w:pPr>
+        <w:rPr>
+          <w:rFonts w:ascii="Arial" w:hAnsi="Arial" w:cs="Arial"/>
+        </w:rPr>
+      </w:pPr>
+      <w:r>
+        <w:rPr>
+          <w:rFonts w:ascii="Arial" w:hAnsi="Arial" w:cs="Arial"/>
+        </w:rPr>
         <w:t>About cut and extra step</w:t>
+      </w:r>
+    </w:p>
+    <w:p>
+      <w:pPr>
+        <w:rPr>
+          <w:rFonts w:ascii="Arial" w:hAnsi="Arial" w:cs="Arial"/>
+        </w:rPr>
+      </w:pPr>
+    </w:p>
+    <w:p>
+      <w:pPr>
+        <w:rPr>
+          <w:rFonts w:ascii="Arial" w:hAnsi="Arial" w:cs="Arial"/>
+        </w:rPr>
+      </w:pPr>
+      <w:r>
+        <w:rPr>
+          <w:rFonts w:ascii="Arial" w:hAnsi="Arial" w:cs="Arial"/>
+        </w:rPr>
+        <w:t xml:space="preserve">NEW: </w:t>
+      </w:r>
+    </w:p>
+    <w:p>
+      <w:pPr>
+        <w:rPr>
+          <w:rFonts w:ascii="Arial" w:hAnsi="Arial" w:cs="Arial"/>
+        </w:rPr>
+      </w:pPr>
+      <w:r>
+        <w:rPr>
+          <w:rFonts w:ascii="Arial" w:hAnsi="Arial" w:cs="Arial"/>
+        </w:rPr>
+        <w:t>De totes les versions explicades, la millor és la binary no sé què.</w:t>
+      </w:r>
+    </w:p>
+    <w:p>
+      <w:pPr>
+        <w:rPr>
+          <w:rFonts w:ascii="Arial" w:hAnsi="Arial" w:cs="Arial"/>
+        </w:rPr>
+      </w:pPr>
+      <w:r>
+        <w:rPr>
+          <w:rFonts w:ascii="Arial" w:hAnsi="Arial" w:cs="Arial"/>
+        </w:rPr>
+        <w:t>Tenint en compte que el nostre graf té 1419 arestes (|E|) i 673 vèrtexs (|V|), i que Q^- es pot acotar per |V|, la “Binary Heap” és la millor opció per la gestió de la cua.</w:t>
+      </w:r>
+    </w:p>
+    <w:p>
+      <w:pPr>
+        <w:rPr>
+          <w:rFonts w:ascii="Arial" w:hAnsi="Arial" w:cs="Arial"/>
+        </w:rPr>
+      </w:pPr>
+      <w:r>
+        <w:rPr>
+          <w:rFonts w:ascii="Arial" w:hAnsi="Arial" w:cs="Arial"/>
+        </w:rPr>
+        <w:t>Les funcions del LL.A. han sigut aplicades literalment però el seu funcionament depèn de la classe MinHeap, qué és feina pròpia</w:t>
+      </w:r>
+      <w:r>
+        <w:rPr>
+          <w:rFonts w:ascii="Arial" w:hAnsi="Arial" w:cs="Arial"/>
+        </w:rPr>
+        <w:t xml:space="preserve"> </w:t>
+      </w:r>
+      <w:r>
+        <w:rPr>
+          <w:rFonts w:ascii="Arial" w:hAnsi="Arial" w:cs="Arial"/>
+        </w:rPr>
+        <w:sym w:font="Wingdings" w:char="F0DF"/>
+      </w:r>
+      <w:r>
+        <w:rPr>
+          <w:rFonts w:ascii="Arial" w:hAnsi="Arial" w:cs="Arial"/>
+        </w:rPr>
+        <w:t xml:space="preserve"> basant-me amb les diapos </w:t>
+      </w:r>
+      <w:r>
+        <w:rPr>
+          <w:rFonts w:ascii="Arial" w:hAnsi="Arial" w:cs="Arial"/>
+        </w:rPr>
+        <w:sym w:font="Wingdings" w:char="F0DF"/>
+      </w:r>
+      <w:r>
+        <w:rPr>
+          <w:rFonts w:ascii="Arial" w:hAnsi="Arial" w:cs="Arial"/>
+        </w:rPr>
+        <w:t xml:space="preserve"> tot està referenciat</w:t>
+      </w:r>
+      <w:r>
+        <w:rPr>
+          <w:rFonts w:ascii="Arial" w:hAnsi="Arial" w:cs="Arial"/>
+        </w:rPr>
+        <w:t xml:space="preserve">. Cal recalcar que la pila només assegura que a la posició 0 hi ha un vèrtex amb la mínima distància entre totes les distàncies existents en elles, però que no implica que les altres posicions estiguin ordenades. </w:t>
+      </w:r>
+    </w:p>
+    <w:p>
+      <w:pPr>
+        <w:rPr>
+          <w:rFonts w:ascii="Arial" w:hAnsi="Arial" w:cs="Arial"/>
+        </w:rPr>
+      </w:pPr>
+      <w:r>
+        <w:rPr>
+          <w:rFonts w:ascii="Arial" w:hAnsi="Arial" w:cs="Arial"/>
+        </w:rPr>
+        <w:t>Quan diferents vèrtexs tenen la mateixa distància a ‘heap’, l’ordre d’extraure els vèrtexs depèn de l’estructura interna del ‘heap’. Als apunts del LL.A. no s’explica una regla per escollir amb preferència un d’aquests. Això explica per què la nova i la vella versió de l’algoritme tenen diferents interacions finals en la versió “cut”.</w:t>
+      </w:r>
+    </w:p>
+    <w:p>
+      <w:pPr>
+        <w:rPr>
+          <w:rFonts w:ascii="Arial" w:hAnsi="Arial" w:cs="Arial"/>
+        </w:rPr>
+      </w:pPr>
+    </w:p>
+    <w:p>
+      <w:pPr>
+        <w:rPr>
+          <w:rFonts w:ascii="Arial" w:hAnsi="Arial" w:cs="Arial"/>
+        </w:rPr>
+      </w:pPr>
+      <w:r>
+        <w:rPr>
+          <w:rFonts w:ascii="Arial" w:hAnsi="Arial" w:cs="Arial"/>
+        </w:rPr>
+        <w:t>Cut</w:t>
+      </w:r>
+    </w:p>
+    <w:p>
+      <w:pPr>
+        <w:rPr>
+          <w:rFonts w:ascii="Arial" w:hAnsi="Arial" w:cs="Arial"/>
+        </w:rPr>
+      </w:pPr>
+      <w:r>
+        <w:rPr>
+          <w:rFonts w:ascii="Arial" w:hAnsi="Arial" w:cs="Arial"/>
+        </w:rPr>
+        <w:t>Basat en la diapositiva 29 (pàgina 37), fet 2:</w:t>
+      </w:r>
+    </w:p>
+    <w:p>
+      <w:pPr>
+        <w:ind w:firstLine="720"/>
+        <w:rPr>
+          <w:rFonts w:ascii="Arial" w:hAnsi="Arial" w:cs="Arial"/>
+        </w:rPr>
+      </w:pPr>
+      <w:r>
+        <w:rPr>
+          <w:rFonts w:ascii="Arial" w:hAnsi="Arial" w:cs="Arial"/>
+        </w:rPr>
+        <w:sym w:font="Wingdings" w:char="F0E0"/>
+      </w:r>
+      <w:r>
+        <w:rPr>
+          <w:rFonts w:ascii="Arial" w:hAnsi="Arial" w:cs="Arial"/>
+        </w:rPr>
+        <w:t xml:space="preserve"> </w:t>
+      </w:r>
+      <w:r>
+        <w:rPr>
+          <w:rFonts w:ascii="Arial" w:hAnsi="Arial" w:cs="Arial"/>
+        </w:rPr>
+        <w:t>When we expand a vertex, we always have an optimal path</w:t>
+      </w:r>
+      <w:r>
+        <w:rPr>
+          <w:rFonts w:ascii="Arial" w:hAnsi="Arial" w:cs="Arial"/>
+        </w:rPr>
+        <w:t xml:space="preserve"> </w:t>
+      </w:r>
+      <w:r>
+        <w:rPr>
+          <w:rFonts w:ascii="Arial" w:hAnsi="Arial" w:cs="Arial"/>
+        </w:rPr>
+        <w:t>from the source to this vertex. So, if we expand the target</w:t>
+      </w:r>
+      <w:r>
+        <w:rPr>
+          <w:rFonts w:ascii="Arial" w:hAnsi="Arial" w:cs="Arial"/>
+        </w:rPr>
+        <w:t xml:space="preserve"> </w:t>
+      </w:r>
+      <w:r>
+        <w:rPr>
+          <w:rFonts w:ascii="Arial" w:hAnsi="Arial" w:cs="Arial"/>
+        </w:rPr>
+        <w:t>vertex, we can stop the algorithm.</w:t>
+      </w:r>
+    </w:p>
+    <w:p>
+      <w:pPr>
+        <w:ind w:firstLine="720"/>
+        <w:rPr>
+          <w:rFonts w:ascii="Arial" w:hAnsi="Arial" w:cs="Arial"/>
+        </w:rPr>
+      </w:pPr>
+      <w:r>
+        <w:rPr>
+          <w:rFonts w:ascii="Arial" w:hAnsi="Arial" w:cs="Arial"/>
+        </w:rPr>
+        <w:t xml:space="preserve"> </w:t>
       </w:r>
     </w:p>
     <w:sectPr>
@@ -26,7 +244,7 @@
 </file>
 
 <file path=word/styles.xml><?xml version="1.0" encoding="utf-8"?>
-<w:styles xmlns:mc="http://schemas.openxmlformats.org/markup-compatibility/2006" xmlns:r="http://schemas.openxmlformats.org/officeDocument/2006/relationships" xmlns:w="http://schemas.openxmlformats.org/wordprocessingml/2006/main" xmlns:w14="http://schemas.microsoft.com/office/word/2010/wordml" xmlns:w15="http://schemas.microsoft.com/office/word/2012/wordml" xmlns:w16cex="http://schemas.microsoft.com/office/word/2018/wordml/cex" xmlns:w16cid="http://schemas.microsoft.com/office/word/2016/wordml/cid" xmlns:w16="http://schemas.microsoft.com/office/word/2018/wordml" xmlns:w16du="http://schemas.microsoft.com/office/word/2023/wordml/word16du" xmlns:w16sdtdh="http://schemas.microsoft.com/office/word/2020/wordml/sdtdatahash" xmlns:w16sdtfl="http://schemas.microsoft.com/office/word/2024/wordml/sdtformatlock" xmlns:w16se="http://schemas.microsoft.com/office/word/2015/wordml/symex" mc:Ignorable="w14 w15 w16se w16cid w16 w16cex w16sdtdh w16sdtfl w16du">
+<w:styles xmlns:mc="http://schemas.openxmlformats.org/markup-compatibility/2006" xmlns:r="http://schemas.openxmlformats.org/officeDocument/2006/relationships" xmlns:w="http://schemas.openxmlformats.org/wordprocessingml/2006/main" xmlns:w14="http://schemas.microsoft.com/office/word/2010/wordml" xmlns:w15="http://schemas.microsoft.com/office/word/2012/wordml" xmlns:w16cex="http://schemas.microsoft.com/office/word/2018/wordml/cex" xmlns:w16cid="http://schemas.microsoft.com/office/word/2016/wordml/cid" xmlns:w16="http://schemas.microsoft.com/office/word/2018/wordml" xmlns:w16sdtdh="http://schemas.microsoft.com/office/word/2020/wordml/sdtdatahash" xmlns:w16sdtfl="http://schemas.microsoft.com/office/word/2024/wordml/sdtformatlock" xmlns:w16se="http://schemas.microsoft.com/office/word/2015/wordml/symex" xmlns:w16du="http://schemas.microsoft.com/office/word/2023/wordml/word16du" mc:Ignorable="w14 w15 w16se w16cid w16 w16cex w16sdtdh w16sdtfl w16du">
   <w:docDefaults>
     <w:rPrDefault>
       <w:rPr>
@@ -628,7 +846,6 @@
   <w:style w:type="character" w:default="1" w:styleId="DefaultParagraphFont">
     <w:name w:val="Default Paragraph Font"/>
     <w:uiPriority w:val="1"/>
-    <w:semiHidden/>
     <w:unhideWhenUsed/>
   </w:style>
   <w:style w:type="table" w:default="1" w:styleId="TableNormal">

</xml_diff>